<commit_message>
Google Docs API + OAuth env vars + Markdown-only pipeline (sin plantillas ni JSON)
</commit_message>
<xml_diff>
--- a/plantillas/Plantilla_Planificacion_Diaria_Nivel_Inicial_Secuencia_De_Experiencias.docx
+++ b/plantillas/Plantilla_Planificacion_Diaria_Nivel_Inicial_Secuencia_De_Experiencias.docx
@@ -5,6 +5,7 @@
     <w:p>
       <w:pPr>
         <w:spacing w:after="0"/>
+        <w:ind w:left="284" w:right="423"/>
         <w:jc w:val="center"/>
       </w:pPr>
       <w:r>
@@ -51,11 +52,13 @@
     <w:p>
       <w:pPr>
         <w:spacing w:after="40" w:line="240" w:lineRule="auto"/>
+        <w:ind w:left="284" w:right="423"/>
       </w:pPr>
     </w:p>
     <w:p>
       <w:pPr>
         <w:spacing w:after="160" w:line="240" w:lineRule="auto"/>
+        <w:ind w:left="284" w:right="423"/>
         <w:jc w:val="center"/>
         <w:rPr>
           <w:lang w:val="es-419"/>
@@ -75,6 +78,7 @@
     <w:p>
       <w:pPr>
         <w:spacing w:after="40"/>
+        <w:ind w:left="284" w:right="423"/>
         <w:rPr>
           <w:lang w:val="es-419"/>
         </w:rPr>
@@ -151,6 +155,7 @@
     <w:p>
       <w:pPr>
         <w:spacing w:after="40"/>
+        <w:ind w:left="284" w:right="423"/>
         <w:rPr>
           <w:lang w:val="es-419"/>
         </w:rPr>
@@ -172,19 +177,8 @@
           <w:sz w:val="21"/>
           <w:lang w:val="es-419"/>
         </w:rPr>
-        <w:t>{{ambito_o_dominio</w:t>
+        <w:t xml:space="preserve">{{ambito_o_dominio}}   </w:t>
       </w:r>
-      <w:proofErr w:type="gramStart"/>
-      <w:r>
-        <w:rPr>
-          <w:rFonts w:eastAsia="Arial"/>
-          <w:color w:val="000000"/>
-          <w:sz w:val="21"/>
-          <w:lang w:val="es-419"/>
-        </w:rPr>
-        <w:t xml:space="preserve">}}   </w:t>
-      </w:r>
-      <w:proofErr w:type="gramEnd"/>
       <w:r>
         <w:rPr>
           <w:rFonts w:eastAsia="Arial"/>
@@ -208,6 +202,7 @@
     <w:p>
       <w:pPr>
         <w:spacing w:after="40"/>
+        <w:ind w:left="284" w:right="423"/>
         <w:rPr>
           <w:lang w:val="es-419"/>
         </w:rPr>
@@ -235,6 +230,7 @@
     <w:p>
       <w:pPr>
         <w:spacing w:after="40"/>
+        <w:ind w:left="284" w:right="423"/>
         <w:rPr>
           <w:lang w:val="es-419"/>
         </w:rPr>
@@ -262,6 +258,7 @@
     <w:p>
       <w:pPr>
         <w:spacing w:after="40"/>
+        <w:ind w:left="284" w:right="423"/>
         <w:rPr>
           <w:lang w:val="es-419"/>
         </w:rPr>
@@ -295,8 +292,8 @@
       </w:tblPr>
       <w:tblGrid>
         <w:gridCol w:w="2097"/>
-        <w:gridCol w:w="7824"/>
-        <w:gridCol w:w="2948"/>
+        <w:gridCol w:w="7400"/>
+        <w:gridCol w:w="3372"/>
         <w:gridCol w:w="2721"/>
       </w:tblGrid>
       <w:tr>
@@ -318,6 +315,7 @@
           <w:p>
             <w:pPr>
               <w:spacing w:after="0" w:line="240" w:lineRule="auto"/>
+              <w:ind w:right="17"/>
               <w:jc w:val="center"/>
               <w:rPr>
                 <w:lang w:val="es-419"/>
@@ -348,7 +346,7 @@
         </w:tc>
         <w:tc>
           <w:tcPr>
-            <w:tcW w:w="7824" w:type="dxa"/>
+            <w:tcW w:w="7400" w:type="dxa"/>
             <w:tcBorders>
               <w:top w:val="single" w:sz="8" w:space="0" w:color="0070C0"/>
               <w:left w:val="single" w:sz="8" w:space="0" w:color="0070C0"/>
@@ -360,6 +358,7 @@
           <w:p>
             <w:pPr>
               <w:spacing w:after="0" w:line="240" w:lineRule="auto"/>
+              <w:ind w:right="17"/>
               <w:jc w:val="center"/>
             </w:pPr>
             <w:r>
@@ -375,7 +374,7 @@
         </w:tc>
         <w:tc>
           <w:tcPr>
-            <w:tcW w:w="2948" w:type="dxa"/>
+            <w:tcW w:w="3372" w:type="dxa"/>
             <w:tcBorders>
               <w:top w:val="single" w:sz="8" w:space="0" w:color="0070C0"/>
               <w:left w:val="single" w:sz="8" w:space="0" w:color="0070C0"/>
@@ -387,6 +386,7 @@
           <w:p>
             <w:pPr>
               <w:spacing w:after="0" w:line="240" w:lineRule="auto"/>
+              <w:ind w:right="17"/>
               <w:jc w:val="center"/>
               <w:rPr>
                 <w:lang w:val="es-419"/>
@@ -440,6 +440,7 @@
           <w:p>
             <w:pPr>
               <w:spacing w:after="0" w:line="240" w:lineRule="auto"/>
+              <w:ind w:right="17"/>
               <w:jc w:val="center"/>
             </w:pPr>
             <w:r>
@@ -472,6 +473,7 @@
           <w:p>
             <w:pPr>
               <w:spacing w:after="0" w:line="240" w:lineRule="auto"/>
+              <w:ind w:right="17"/>
             </w:pPr>
             <w:r>
               <w:rPr>
@@ -506,7 +508,7 @@
         </w:tc>
         <w:tc>
           <w:tcPr>
-            <w:tcW w:w="7824" w:type="dxa"/>
+            <w:tcW w:w="7400" w:type="dxa"/>
             <w:tcBorders>
               <w:top w:val="single" w:sz="8" w:space="0" w:color="0070C0"/>
               <w:left w:val="single" w:sz="8" w:space="0" w:color="0070C0"/>
@@ -517,6 +519,7 @@
           <w:p>
             <w:pPr>
               <w:spacing w:after="0" w:line="240" w:lineRule="auto"/>
+              <w:ind w:right="17"/>
             </w:pPr>
             <w:r>
               <w:rPr>
@@ -529,7 +532,7 @@
         </w:tc>
         <w:tc>
           <w:tcPr>
-            <w:tcW w:w="2948" w:type="dxa"/>
+            <w:tcW w:w="3372" w:type="dxa"/>
             <w:tcBorders>
               <w:top w:val="single" w:sz="8" w:space="0" w:color="0070C0"/>
               <w:left w:val="single" w:sz="8" w:space="0" w:color="0070C0"/>
@@ -540,6 +543,7 @@
           <w:p>
             <w:pPr>
               <w:spacing w:after="0" w:line="240" w:lineRule="auto"/>
+              <w:ind w:right="17"/>
             </w:pPr>
             <w:r>
               <w:rPr>
@@ -563,6 +567,7 @@
           <w:p>
             <w:pPr>
               <w:spacing w:after="0" w:line="240" w:lineRule="auto"/>
+              <w:ind w:right="17"/>
             </w:pPr>
             <w:r>
               <w:rPr>
@@ -592,6 +597,7 @@
           <w:p>
             <w:pPr>
               <w:spacing w:after="0" w:line="240" w:lineRule="auto"/>
+              <w:ind w:right="17"/>
               <w:rPr>
                 <w:lang w:val="es-419"/>
               </w:rPr>
@@ -632,7 +638,7 @@
         </w:tc>
         <w:tc>
           <w:tcPr>
-            <w:tcW w:w="7824" w:type="dxa"/>
+            <w:tcW w:w="7400" w:type="dxa"/>
             <w:tcBorders>
               <w:top w:val="single" w:sz="8" w:space="0" w:color="0070C0"/>
               <w:left w:val="single" w:sz="8" w:space="0" w:color="0070C0"/>
@@ -643,6 +649,7 @@
           <w:p>
             <w:pPr>
               <w:spacing w:after="0" w:line="240" w:lineRule="auto"/>
+              <w:ind w:right="17"/>
             </w:pPr>
             <w:r>
               <w:rPr>
@@ -655,7 +662,7 @@
         </w:tc>
         <w:tc>
           <w:tcPr>
-            <w:tcW w:w="2948" w:type="dxa"/>
+            <w:tcW w:w="3372" w:type="dxa"/>
             <w:tcBorders>
               <w:top w:val="single" w:sz="8" w:space="0" w:color="0070C0"/>
               <w:left w:val="single" w:sz="8" w:space="0" w:color="0070C0"/>
@@ -666,6 +673,7 @@
           <w:p>
             <w:pPr>
               <w:spacing w:after="0" w:line="240" w:lineRule="auto"/>
+              <w:ind w:right="17"/>
             </w:pPr>
             <w:r>
               <w:rPr>
@@ -689,6 +697,7 @@
           <w:p>
             <w:pPr>
               <w:spacing w:after="0" w:line="240" w:lineRule="auto"/>
+              <w:ind w:right="17"/>
             </w:pPr>
             <w:r>
               <w:rPr>
@@ -718,6 +727,7 @@
           <w:p>
             <w:pPr>
               <w:spacing w:after="0" w:line="240" w:lineRule="auto"/>
+              <w:ind w:right="17"/>
             </w:pPr>
             <w:r>
               <w:rPr>
@@ -752,7 +762,7 @@
         </w:tc>
         <w:tc>
           <w:tcPr>
-            <w:tcW w:w="7824" w:type="dxa"/>
+            <w:tcW w:w="7400" w:type="dxa"/>
             <w:tcBorders>
               <w:top w:val="single" w:sz="8" w:space="0" w:color="0070C0"/>
               <w:left w:val="single" w:sz="8" w:space="0" w:color="0070C0"/>
@@ -763,6 +773,7 @@
           <w:p>
             <w:pPr>
               <w:spacing w:after="0" w:line="240" w:lineRule="auto"/>
+              <w:ind w:right="17"/>
             </w:pPr>
             <w:r>
               <w:rPr>
@@ -775,7 +786,7 @@
         </w:tc>
         <w:tc>
           <w:tcPr>
-            <w:tcW w:w="2948" w:type="dxa"/>
+            <w:tcW w:w="3372" w:type="dxa"/>
             <w:tcBorders>
               <w:top w:val="single" w:sz="8" w:space="0" w:color="0070C0"/>
               <w:left w:val="single" w:sz="8" w:space="0" w:color="0070C0"/>
@@ -786,6 +797,7 @@
           <w:p>
             <w:pPr>
               <w:spacing w:after="0" w:line="240" w:lineRule="auto"/>
+              <w:ind w:right="17"/>
             </w:pPr>
             <w:r>
               <w:rPr>
@@ -809,6 +821,7 @@
           <w:p>
             <w:pPr>
               <w:spacing w:after="0" w:line="240" w:lineRule="auto"/>
+              <w:ind w:right="17"/>
             </w:pPr>
             <w:r>
               <w:rPr>
@@ -838,6 +851,7 @@
           <w:p>
             <w:pPr>
               <w:spacing w:after="0" w:line="240" w:lineRule="auto"/>
+              <w:ind w:right="17"/>
               <w:rPr>
                 <w:lang w:val="es-419"/>
               </w:rPr>
@@ -878,7 +892,7 @@
         </w:tc>
         <w:tc>
           <w:tcPr>
-            <w:tcW w:w="7824" w:type="dxa"/>
+            <w:tcW w:w="7400" w:type="dxa"/>
             <w:tcBorders>
               <w:top w:val="single" w:sz="8" w:space="0" w:color="0070C0"/>
               <w:left w:val="single" w:sz="8" w:space="0" w:color="0070C0"/>
@@ -889,6 +903,7 @@
           <w:p>
             <w:pPr>
               <w:spacing w:after="0" w:line="240" w:lineRule="auto"/>
+              <w:ind w:right="17"/>
             </w:pPr>
             <w:r>
               <w:rPr>
@@ -901,7 +916,7 @@
         </w:tc>
         <w:tc>
           <w:tcPr>
-            <w:tcW w:w="2948" w:type="dxa"/>
+            <w:tcW w:w="3372" w:type="dxa"/>
             <w:tcBorders>
               <w:top w:val="single" w:sz="8" w:space="0" w:color="0070C0"/>
               <w:left w:val="single" w:sz="8" w:space="0" w:color="0070C0"/>
@@ -912,6 +927,7 @@
           <w:p>
             <w:pPr>
               <w:spacing w:after="0" w:line="240" w:lineRule="auto"/>
+              <w:ind w:right="17"/>
             </w:pPr>
             <w:r>
               <w:rPr>
@@ -935,6 +951,7 @@
           <w:p>
             <w:pPr>
               <w:spacing w:after="0" w:line="240" w:lineRule="auto"/>
+              <w:ind w:right="17"/>
             </w:pPr>
             <w:r>
               <w:rPr>
@@ -950,6 +967,7 @@
     <w:p>
       <w:pPr>
         <w:spacing w:after="0"/>
+        <w:ind w:left="284" w:right="423"/>
         <w:rPr>
           <w:lang w:val="es-419"/>
         </w:rPr>
@@ -977,6 +995,7 @@
     <w:p>
       <w:pPr>
         <w:spacing w:after="0"/>
+        <w:ind w:left="284" w:right="423"/>
         <w:rPr>
           <w:lang w:val="es-419"/>
         </w:rPr>

</xml_diff>